<commit_message>
IEEE presentation cleanup: readable table headers and rounding, merged 95% CI columns, leave-one-out, unrounded recovery-time and exact-p tables moved to supplementary files S1-S3, exact p in one sentence with a footnote, short deviations table with Deviation 13, plain variable and service names, Fig. 2 labels separated, Fig. 5 legend below the panels
New files: paper/deviations_short.csv (hand-written short labels for the appendix table) and paper/tables/tbl_ieee_*. No file deleted or moved.

Co-Authored-By: Claude Opus 5.5 <noreply@anthropic.com>
</commit_message>
<xml_diff>
--- a/paper/submission/Table 10.docx
+++ b/paper/submission/Table 10.docx
@@ -2632,6 +2632,206 @@
           </w:p>
         </w:tc>
       </w:tr>
+      <w:tr>
+        <w:tc>
+          <w:tcPr>
+            <w:tcW w:type="dxa" w:w="1182"/>
+          </w:tcPr>
+          <w:p>
+            <w:pPr>
+              <w:spacing w:line="240" w:lineRule="auto"/>
+            </w:pPr>
+            <w:r/>
+            <w:r>
+              <w:rPr>
+                <w:b w:val="0"/>
+                <w:sz w:val="18"/>
+              </w:rPr>
+              <w:t>13</w:t>
+            </w:r>
+          </w:p>
+        </w:tc>
+        <w:tc>
+          <w:tcPr>
+            <w:tcW w:type="dxa" w:w="1182"/>
+          </w:tcPr>
+          <w:p>
+            <w:pPr>
+              <w:spacing w:line="240" w:lineRule="auto"/>
+            </w:pPr>
+            <w:r/>
+            <w:r>
+              <w:rPr>
+                <w:b w:val="0"/>
+                <w:sz w:val="18"/>
+              </w:rPr>
+              <w:t>2026-10-20</w:t>
+            </w:r>
+          </w:p>
+        </w:tc>
+        <w:tc>
+          <w:tcPr>
+            <w:tcW w:type="dxa" w:w="1182"/>
+          </w:tcPr>
+          <w:p>
+            <w:pPr>
+              <w:spacing w:line="240" w:lineRule="auto"/>
+            </w:pPr>
+            <w:r/>
+            <w:r>
+              <w:rPr>
+                <w:b w:val="0"/>
+                <w:sz w:val="18"/>
+              </w:rPr>
+              <w:t>Baseline window includes the load ramp-up</w:t>
+            </w:r>
+          </w:p>
+        </w:tc>
+        <w:tc>
+          <w:tcPr>
+            <w:tcW w:type="dxa" w:w="1182"/>
+          </w:tcPr>
+          <w:p>
+            <w:pPr>
+              <w:spacing w:line="240" w:lineRule="auto"/>
+            </w:pPr>
+            <w:r/>
+            <w:r>
+              <w:rPr>
+                <w:b w:val="0"/>
+                <w:sz w:val="18"/>
+              </w:rPr>
+              <w:t>found during manuscript preparation, after the analysis</w:t>
+            </w:r>
+          </w:p>
+        </w:tc>
+        <w:tc>
+          <w:tcPr>
+            <w:tcW w:type="dxa" w:w="1182"/>
+          </w:tcPr>
+          <w:p>
+            <w:pPr>
+              <w:spacing w:line="240" w:lineRule="auto"/>
+            </w:pPr>
+            <w:r/>
+            <w:r>
+              <w:rPr>
+                <w:b w:val="0"/>
+                <w:sz w:val="18"/>
+              </w:rPr>
+              <w:t>The baseline percentiles are computed over the first 60 s after the load generator starts, including its ramp-up: tools/run_pilot.py one_run sleeps for the warm-up and then takes the baseline over the preceding window of the same length. The locked plan (section 8) describes a 60 s warm-up followed by a baseline. Earlier manuscript text described a separate baseline after the warm-up, which the code does not do.</w:t>
+            </w:r>
+          </w:p>
+        </w:tc>
+        <w:tc>
+          <w:tcPr>
+            <w:tcW w:type="dxa" w:w="1182"/>
+          </w:tcPr>
+          <w:p>
+            <w:pPr>
+              <w:spacing w:line="240" w:lineRule="auto"/>
+            </w:pPr>
+            <w:r/>
+            <w:r>
+              <w:rPr>
+                <w:b w:val="0"/>
+                <w:sz w:val="18"/>
+              </w:rPr>
+              <w:t>Nothing in any locked output, stored outcome or the measurement code. The manuscript now describes the window as computed and lists the difference as a threat to validity. The baseline-sanity gate, which compares each run's fault-free baseline with the rest of the campaign, found no anomalous baselines.</w:t>
+            </w:r>
+          </w:p>
+        </w:tc>
+        <w:tc>
+          <w:tcPr>
+            <w:tcW w:type="dxa" w:w="1182"/>
+          </w:tcPr>
+          <w:p>
+            <w:pPr>
+              <w:spacing w:line="240" w:lineRule="auto"/>
+            </w:pPr>
+            <w:r/>
+            <w:r>
+              <w:rPr>
+                <w:b w:val="0"/>
+                <w:sz w:val="18"/>
+              </w:rPr>
+              <w:t>none known; the size of any ramp-up effect on the baselines was not measured</w:t>
+            </w:r>
+          </w:p>
+        </w:tc>
+        <w:tc>
+          <w:tcPr>
+            <w:tcW w:type="dxa" w:w="1182"/>
+          </w:tcPr>
+          <w:p>
+            <w:pPr>
+              <w:spacing w:line="240" w:lineRule="auto"/>
+            </w:pPr>
+            <w:r/>
+            <w:r>
+              <w:rPr>
+                <w:b w:val="0"/>
+                <w:sz w:val="18"/>
+              </w:rPr>
+              <w:t>0</w:t>
+            </w:r>
+          </w:p>
+        </w:tc>
+        <w:tc>
+          <w:tcPr>
+            <w:tcW w:type="dxa" w:w="1182"/>
+          </w:tcPr>
+          <w:p>
+            <w:pPr>
+              <w:spacing w:line="240" w:lineRule="auto"/>
+            </w:pPr>
+            <w:r/>
+            <w:r>
+              <w:rPr>
+                <w:b w:val="0"/>
+                <w:sz w:val="18"/>
+              </w:rPr>
+              <w:t>not applicable</w:t>
+            </w:r>
+          </w:p>
+        </w:tc>
+        <w:tc>
+          <w:tcPr>
+            <w:tcW w:type="dxa" w:w="1182"/>
+          </w:tcPr>
+          <w:p>
+            <w:pPr>
+              <w:spacing w:line="240" w:lineRule="auto"/>
+            </w:pPr>
+            <w:r/>
+            <w:r>
+              <w:rPr>
+                <w:b w:val="0"/>
+                <w:sz w:val="18"/>
+              </w:rPr>
+              <w:t>PREREGISTRATION.md section 12 deviation 13; paper/CLAIMS_LEDGER.md 13.3</w:t>
+            </w:r>
+          </w:p>
+        </w:tc>
+        <w:tc>
+          <w:tcPr>
+            <w:tcW w:type="dxa" w:w="1182"/>
+          </w:tcPr>
+          <w:p>
+            <w:pPr>
+              <w:spacing w:line="240" w:lineRule="auto"/>
+            </w:pPr>
+            <w:r/>
+            <w:r>
+              <w:rPr>
+                <w:b w:val="0"/>
+                <w:sz w:val="18"/>
+              </w:rPr>
+              <w:t>read-only comparison of the runner code with the manuscript text, 2026-10-20</w:t>
+            </w:r>
+          </w:p>
+        </w:tc>
+      </w:tr>
     </w:tbl>
     <w:p>
       <w:r>

</xml_diff>